<commit_message>
Keep right-aligned dates from colliding with long headings
A heading long enough to fill its line pushed the right-hand date or
location into it ("...outflowsApr 2021") or split it across lines.
Use the TeXbook \signed technique: the right-hand text stays on the
same line when there is room, otherwise it goes flush right on the
next line, unbroken. Also emit \item{} so list items that start with
"[12]" are not read as an \item optional label. The resume's text is
unchanged.

Co-Authored-By: Claude Opus 5.5 <noreply@anthropic.com>
</commit_message>
<xml_diff>
--- a/RuedaBecerrilJM-resume-plain.docx
+++ b/RuedaBecerrilJM-resume-plain.docx
@@ -28,7 +28,7 @@
       <w:r>
         <w:t xml:space="preserve">  |  </w:t>
       </w:r>
-      <w:hyperlink w:history="1" r:id="rIdmxrhanzr_x_geip3fplg1">
+      <w:hyperlink w:history="1" r:id="rIdduhv_le9khb71etuxvdvn">
         <w:r>
           <w:t xml:space="preserve">jm.ruebe@gmail.com</w:t>
         </w:r>
@@ -42,7 +42,7 @@
       <w:r>
         <w:t xml:space="preserve">  |  </w:t>
       </w:r>
-      <w:hyperlink w:history="1" r:id="rId2mh_sjxiterzj-ljjp9v6">
+      <w:hyperlink w:history="1" r:id="rIdzeaadr6dtlj-pb3vekmor">
         <w:r>
           <w:t xml:space="preserve">linkedin.com/in/jeruebe</w:t>
         </w:r>
@@ -50,7 +50,7 @@
       <w:r>
         <w:t xml:space="preserve">  |  </w:t>
       </w:r>
-      <w:hyperlink w:history="1" r:id="rIdlylpr-2xatshj2oc_543t">
+      <w:hyperlink w:history="1" r:id="rIdvmzx2rbrykwu6cotthejw">
         <w:r>
           <w:t xml:space="preserve">altjerue.github.io</w:t>
         </w:r>
@@ -1000,7 +1000,7 @@
       <w:r>
         <w:tab/>
       </w:r>
-      <w:hyperlink w:history="1" r:id="rIdsaobnzbvwha3lvanqtimv">
+      <w:hyperlink w:history="1" r:id="rIdgyw6fcwjojyssd45bcx8s">
         <w:r>
           <w:t xml:space="preserve">github.com/altjerue/ilwikak-ml</w:t>
         </w:r>
@@ -1091,7 +1091,7 @@
       <w:r>
         <w:t xml:space="preserve">, </w:t>
       </w:r>
-      <w:hyperlink w:history="1" r:id="rIdi7uylfv8ngp55chuypqqw">
+      <w:hyperlink w:history="1" r:id="rIdlvnmkn3ndra_gi693qo3-">
         <w:r>
           <w:t xml:space="preserve">ApJ 976, 182 (2024)</w:t>
         </w:r>
@@ -1099,7 +1099,7 @@
       <w:r>
         <w:t xml:space="preserve">, </w:t>
       </w:r>
-      <w:hyperlink w:history="1" r:id="rIdla64clx9l84rbkbggtosb">
+      <w:hyperlink w:history="1" r:id="rIdfrpzdzffaueoyt58yk87s">
         <w:r>
           <w:t xml:space="preserve">arXiv:2405.17581</w:t>
         </w:r>
@@ -1137,7 +1137,7 @@
       <w:r>
         <w:t xml:space="preserve">, </w:t>
       </w:r>
-      <w:hyperlink w:history="1" r:id="rIdmivvbi2ceybvputka1iqv">
+      <w:hyperlink w:history="1" r:id="rIdlxkdykdv3xnzksuhct0ji">
         <w:r>
           <w:t xml:space="preserve">MNRAS 501, 4092–4102 (2021)</w:t>
         </w:r>
@@ -1145,7 +1145,7 @@
       <w:r>
         <w:t xml:space="preserve">, </w:t>
       </w:r>
-      <w:hyperlink w:history="1" r:id="rIdq4uenq7wmxdvd4xi8lsbx">
+      <w:hyperlink w:history="1" r:id="rIdw0kdsawnjwtrkov6vjcmf">
         <w:r>
           <w:t xml:space="preserve">arXiv:2009.02273</w:t>
         </w:r>
@@ -1183,7 +1183,7 @@
       <w:r>
         <w:t xml:space="preserve">, </w:t>
       </w:r>
-      <w:hyperlink w:history="1" r:id="rIdwg0reklia3wr6m6rd8prf">
+      <w:hyperlink w:history="1" r:id="rIdleegpdkcruefz9aamsi_a">
         <w:r>
           <w:t xml:space="preserve">MNRAS 468, 1169–1182 (2017)</w:t>
         </w:r>
@@ -1191,7 +1191,7 @@
       <w:r>
         <w:t xml:space="preserve">, </w:t>
       </w:r>
-      <w:hyperlink w:history="1" r:id="rIdfvxf0v7_z8x9zq6he2c2m">
+      <w:hyperlink w:history="1" r:id="rIdgbrtnu8dtwrfq92vpdhuh">
         <w:r>
           <w:t xml:space="preserve">arXiv:1612.06383</w:t>
         </w:r>
@@ -1567,17 +1567,6 @@
     <w:rPr>
       <w:sz w:val="56"/>
       <w:szCs w:val="56"/>
-    </w:rPr>
-  </w:style>
-  <w:style w:type="paragraph" w:styleId="Heading2">
-    <w:name w:val="Heading 2"/>
-    <w:basedOn w:val="Normal"/>
-    <w:next w:val="Normal"/>
-    <w:qFormat/>
-    <w:rPr>
-      <w:color w:val="2E74B5"/>
-      <w:sz w:val="26"/>
-      <w:szCs w:val="26"/>
     </w:rPr>
   </w:style>
   <w:style w:type="paragraph" w:styleId="Heading3">
@@ -1739,6 +1728,25 @@
       <w:color w:val="000000"/>
       <w:sz w:val="24"/>
       <w:szCs w:val="24"/>
+    </w:rPr>
+  </w:style>
+  <w:style w:type="paragraph" w:styleId="Heading2">
+    <w:name w:val="Heading 2"/>
+    <w:basedOn w:val="Normal"/>
+    <w:next w:val="Normal"/>
+    <w:qFormat/>
+    <w:pPr>
+      <w:keepNext/>
+      <w:spacing w:after="40" w:before="80"/>
+      <w:outlineLvl w:val="1"/>
+    </w:pPr>
+    <w:rPr>
+      <w:rFonts w:ascii="Calibri" w:cs="Calibri" w:eastAsia="Calibri" w:hAnsi="Calibri"/>
+      <w:b/>
+      <w:bCs/>
+      <w:color w:val="000000"/>
+      <w:sz w:val="20"/>
+      <w:szCs w:val="20"/>
     </w:rPr>
   </w:style>
   <w:style w:type="paragraph" w:styleId="EntryGap">

</xml_diff>

<commit_message>
Add quantified details and Independent Researcher entry to moderncv resume
Co-Authored-By: Claude Sonnet 5.5 <noreply@anthropic.com>
</commit_message>
<xml_diff>
--- a/RuedaBecerrilJM-resume-plain.docx
+++ b/RuedaBecerrilJM-resume-plain.docx
@@ -28,7 +28,7 @@
       <w:r>
         <w:t xml:space="preserve">  |  </w:t>
       </w:r>
-      <w:hyperlink w:history="1" r:id="rIdcade4v3crbsx999flmpcu">
+      <w:hyperlink w:history="1" r:id="rIdraihusn6bvjyhjro6tge3">
         <w:r>
           <w:t xml:space="preserve">jm.ruebe@gmail.com</w:t>
         </w:r>
@@ -42,7 +42,7 @@
       <w:r>
         <w:t xml:space="preserve">  |  </w:t>
       </w:r>
-      <w:hyperlink w:history="1" r:id="rIdxjo0ldywlby9-k7httpjs">
+      <w:hyperlink w:history="1" r:id="rIdvhoifflflfj4oijxjlonz">
         <w:r>
           <w:t xml:space="preserve">linkedin.com/in/jeruebe</w:t>
         </w:r>
@@ -50,7 +50,7 @@
       <w:r>
         <w:t xml:space="preserve">  |  </w:t>
       </w:r>
-      <w:hyperlink w:history="1" r:id="rIdfxdwxyyp0vvmefcampiow">
+      <w:hyperlink w:history="1" r:id="rIdjkt4mzopgs96khoopa7uu">
         <w:r>
           <w:t xml:space="preserve">altjerue.github.io</w:t>
         </w:r>
@@ -223,7 +223,7 @@
         <w:spacing w:after="10"/>
       </w:pPr>
       <w:r>
-        <w:t xml:space="preserve">Reviewed 50+ expert-level problems in physics, hydrodynamics, astrophysics, and cosmology; wrote original prompts that stumped frontier models and co-developed others with fellow writers.</w:t>
+        <w:t xml:space="preserve">Reviewed 50+ expert-level problems in physics, hydrodynamics, astrophysics, and cosmology; wrote original prompts that stumped frontier models.</w:t>
       </w:r>
     </w:p>
     <w:p>
@@ -909,7 +909,7 @@
       <w:r>
         <w:tab/>
       </w:r>
-      <w:hyperlink w:history="1" r:id="rId0ip9w0wgf_7ydvtymm2ek">
+      <w:hyperlink w:history="1" r:id="rId66aqeq4on5yc2fkbn78av">
         <w:r>
           <w:t xml:space="preserve">github.com/altjerue/ilwikak-ml</w:t>
         </w:r>
@@ -1000,7 +1000,7 @@
       <w:r>
         <w:t xml:space="preserve">, </w:t>
       </w:r>
-      <w:hyperlink w:history="1" r:id="rIdxik4q7zqzt6-e2xuq4riy">
+      <w:hyperlink w:history="1" r:id="rId4z4qw2kzlp0fprin_j1sm">
         <w:r>
           <w:t xml:space="preserve">ApJ 976, 182 (2024)</w:t>
         </w:r>
@@ -1008,7 +1008,7 @@
       <w:r>
         <w:t xml:space="preserve">, </w:t>
       </w:r>
-      <w:hyperlink w:history="1" r:id="rIdxxjwxmlq6yhymz83p9fq5">
+      <w:hyperlink w:history="1" r:id="rIdgelhwsd0e91gugnbgmh_n">
         <w:r>
           <w:t xml:space="preserve">arXiv:2405.17581</w:t>
         </w:r>
@@ -1046,7 +1046,7 @@
       <w:r>
         <w:t xml:space="preserve">, </w:t>
       </w:r>
-      <w:hyperlink w:history="1" r:id="rIdumyoq7zzrimlv7gqeqs0w">
+      <w:hyperlink w:history="1" r:id="rIdk1w4tpuov_uvzn3bcss9m">
         <w:r>
           <w:t xml:space="preserve">MNRAS 501, 4092–4102 (2021)</w:t>
         </w:r>
@@ -1054,7 +1054,7 @@
       <w:r>
         <w:t xml:space="preserve">, </w:t>
       </w:r>
-      <w:hyperlink w:history="1" r:id="rIdebr7-t06nizdveytqcvtb">
+      <w:hyperlink w:history="1" r:id="rIdlembxqnmxz9yqhdkg3ap2">
         <w:r>
           <w:t xml:space="preserve">arXiv:2009.02273</w:t>
         </w:r>
@@ -1092,7 +1092,7 @@
       <w:r>
         <w:t xml:space="preserve">, </w:t>
       </w:r>
-      <w:hyperlink w:history="1" r:id="rIdj28rcvsnaeramu1qcfm8v">
+      <w:hyperlink w:history="1" r:id="rIdyfvpm2j_ip0iu-aa-swi_">
         <w:r>
           <w:t xml:space="preserve">MNRAS 468, 1169–1182 (2017)</w:t>
         </w:r>
@@ -1100,7 +1100,7 @@
       <w:r>
         <w:t xml:space="preserve">, </w:t>
       </w:r>
-      <w:hyperlink w:history="1" r:id="rId3mjclwsqm1uwv2du50axl">
+      <w:hyperlink w:history="1" r:id="rIdrhvbdqvnmk7b3pkwuvsh5">
         <w:r>
           <w:t xml:space="preserve">arXiv:1612.06383</w:t>
         </w:r>

</xml_diff>

<commit_message>
Show graduation dates for every degree in the resume
Education listed a year only for the Ph.D.; all three degrees now show
their graduation month and year on the right: Jul 2017, Sep 2011,
Dec 2008. Still 2 pages in every format.

Co-Authored-By: Claude Opus 5.5 <noreply@anthropic.com>
</commit_message>
<xml_diff>
--- a/RuedaBecerrilJM-resume-plain.docx
+++ b/RuedaBecerrilJM-resume-plain.docx
@@ -28,7 +28,7 @@
       <w:r>
         <w:t xml:space="preserve">  |  </w:t>
       </w:r>
-      <w:hyperlink w:history="1" r:id="rIdicznu2btrup3aqmjacavl">
+      <w:hyperlink w:history="1" r:id="rIdvqethe-i7t4kyi-kz_vk6">
         <w:r>
           <w:t xml:space="preserve">jm.ruebe@gmail.com</w:t>
         </w:r>
@@ -42,7 +42,7 @@
       <w:r>
         <w:t xml:space="preserve">  |  </w:t>
       </w:r>
-      <w:hyperlink w:history="1" r:id="rIdqhjlfdlgpf1ly7vikvfvg">
+      <w:hyperlink w:history="1" r:id="rId2ehjthyfdyco35ipa4llz">
         <w:r>
           <w:t xml:space="preserve">linkedin.com/in/jeruebe</w:t>
         </w:r>
@@ -50,7 +50,7 @@
       <w:r>
         <w:t xml:space="preserve">  |  </w:t>
       </w:r>
-      <w:hyperlink w:history="1" r:id="rIdvrjzzxkcdry0c3i6e-lh0">
+      <w:hyperlink w:history="1" r:id="rIdxaez3ok9rm8zzc0kh6zkn">
         <w:r>
           <w:t xml:space="preserve">altjerue.github.io</w:t>
         </w:r>
@@ -772,7 +772,7 @@
       <w:r>
         <w:tab/>
       </w:r>
-      <w:hyperlink w:history="1" r:id="rId8gzpyb4miqof1tzd4dsvb">
+      <w:hyperlink w:history="1" r:id="rId1wsdcyj5xnpa-w9yipbuj">
         <w:r>
           <w:t xml:space="preserve">github.com/altjerue/ilwikak-ml</w:t>
         </w:r>
@@ -863,7 +863,7 @@
       <w:r>
         <w:t xml:space="preserve">, </w:t>
       </w:r>
-      <w:hyperlink w:history="1" r:id="rIdjjyffjf4wsiibscojso29">
+      <w:hyperlink w:history="1" r:id="rIdynsynlxpbcllmqfgx6psr">
         <w:r>
           <w:t xml:space="preserve">ApJ 976, 182 (2024)</w:t>
         </w:r>
@@ -871,7 +871,7 @@
       <w:r>
         <w:t xml:space="preserve">, </w:t>
       </w:r>
-      <w:hyperlink w:history="1" r:id="rIdakxk_jdilcav1mrzomufh">
+      <w:hyperlink w:history="1" r:id="rIdxugjj_hwxzefxyr3sotxf">
         <w:r>
           <w:t xml:space="preserve">arXiv:2405.17581</w:t>
         </w:r>
@@ -909,7 +909,7 @@
       <w:r>
         <w:t xml:space="preserve">, </w:t>
       </w:r>
-      <w:hyperlink w:history="1" r:id="rIdvl2zab44j7bxok33gtiln">
+      <w:hyperlink w:history="1" r:id="rIdfc5oyv5fvjbjytmh02ryy">
         <w:r>
           <w:t xml:space="preserve">MNRAS 501, 4092–4102 (2021)</w:t>
         </w:r>
@@ -917,7 +917,7 @@
       <w:r>
         <w:t xml:space="preserve">, </w:t>
       </w:r>
-      <w:hyperlink w:history="1" r:id="rIdu65vv1urnfigtlbm7hmup">
+      <w:hyperlink w:history="1" r:id="rIdtqb1nwlw3hhetqk_qer6w">
         <w:r>
           <w:t xml:space="preserve">arXiv:2009.02273</w:t>
         </w:r>
@@ -955,7 +955,7 @@
       <w:r>
         <w:t xml:space="preserve">, </w:t>
       </w:r>
-      <w:hyperlink w:history="1" r:id="rIdzjnc-7605ihyrgpvzttv4">
+      <w:hyperlink w:history="1" r:id="rIdwaoc391_i3vvzh8xtboq7">
         <w:r>
           <w:t xml:space="preserve">MNRAS 468, 1169–1182 (2017)</w:t>
         </w:r>
@@ -963,7 +963,7 @@
       <w:r>
         <w:t xml:space="preserve">, </w:t>
       </w:r>
-      <w:hyperlink w:history="1" r:id="rId4zky2xkl8eog8vxvvpq03">
+      <w:hyperlink w:history="1" r:id="rIda2glrovxptfdunev496hi">
         <w:r>
           <w:t xml:space="preserve">arXiv:1612.06383</w:t>
         </w:r>
@@ -1009,7 +1009,7 @@
         <w:tab/>
       </w:r>
       <w:r>
-        <w:t xml:space="preserve">2017</w:t>
+        <w:t xml:space="preserve">Jul 2017</w:t>
       </w:r>
     </w:p>
     <w:p>
@@ -1043,6 +1043,12 @@
         </w:rPr>
         <w:t xml:space="preserve">M.Sc. in Physics</w:t>
       </w:r>
+      <w:r>
+        <w:tab/>
+      </w:r>
+      <w:r>
+        <w:t xml:space="preserve">Sep 2011</w:t>
+      </w:r>
     </w:p>
     <w:p>
       <w:pPr>
@@ -1074,6 +1080,12 @@
           <w:iCs/>
         </w:rPr>
         <w:t xml:space="preserve">B.Sc. in Physics</w:t>
+      </w:r>
+      <w:r>
+        <w:tab/>
+      </w:r>
+      <w:r>
+        <w:t xml:space="preserve">Dec 2008</w:t>
       </w:r>
     </w:p>
     <w:p>

</xml_diff>

<commit_message>
Tailor resume for Anthropic STEM Fellow role
Co-Authored-By: Claude Sonnet 5.5 <noreply@anthropic.com>
</commit_message>
<xml_diff>
--- a/RuedaBecerrilJM-resume-plain.docx
+++ b/RuedaBecerrilJM-resume-plain.docx
@@ -28,7 +28,7 @@
       <w:r>
         <w:t xml:space="preserve">  |  </w:t>
       </w:r>
-      <w:hyperlink w:history="1" r:id="rIdknbk8tszn4dk89xxah031">
+      <w:hyperlink w:history="1" r:id="rIdducyetrweo1i7fov8oyer">
         <w:r>
           <w:t xml:space="preserve">jm.ruebe@gmail.com</w:t>
         </w:r>
@@ -42,7 +42,7 @@
       <w:r>
         <w:t xml:space="preserve">  |  </w:t>
       </w:r>
-      <w:hyperlink w:history="1" r:id="rIdrmzvi0onwebfxjwdkcme1">
+      <w:hyperlink w:history="1" r:id="rIdodsoy26leggcrbbtjommt">
         <w:r>
           <w:t xml:space="preserve">linkedin.com/in/jeruebe</w:t>
         </w:r>
@@ -50,7 +50,7 @@
       <w:r>
         <w:t xml:space="preserve">  |  </w:t>
       </w:r>
-      <w:hyperlink w:history="1" r:id="rId_w10k8seq16vf-maoxkvt">
+      <w:hyperlink w:history="1" r:id="rId9qahnu6gyfd6dqx18aspg">
         <w:r>
           <w:t xml:space="preserve">altjerue.github.io</w:t>
         </w:r>
@@ -66,7 +66,7 @@
     </w:p>
     <w:p>
       <w:r>
-        <w:t xml:space="preserve">Research engineer and computational scientist with a PhD in Physics and over ten years of experience building physics-based numerical models (PDE solvers, radiative transfer, MHD) and applying machine learning to physical-science problems. Python-fluent, with GPU and HPC experience and an open-source track record: architected and maintained simulation libraries adopted by other research groups, tested and shipped code through CI/CD with test suites, and mentored students. Strong at pairing physical principles with data-driven models and explaining the results to scientific and engineering audiences.</w:t>
+        <w:t xml:space="preserve">Physicist (PhD) with over ten years of experience building the simulations, datasets, and analysis code that test scientific ideas against data. Currently an expert evaluator of frontier language models: writing hard physics problems that stump them and diagnosing where their reasoning fails. Background in physics-based numerical modeling (PDE solvers, radiative transfer, MHD), scientific machine learning, and open-source research software adopted by other groups. Postdoctoral experience leading teams and mentoring students, and a habit of explaining technical results clearly to mixed audiences.</w:t>
       </w:r>
     </w:p>
     <w:p>
@@ -135,6 +135,21 @@
       </w:r>
       <w:r>
         <w:t xml:space="preserve">OpenMP, OpenACC (GPU offloading), MPI, SLURM, PBS, HDF5</w:t>
+      </w:r>
+    </w:p>
+    <w:p>
+      <w:pPr>
+        <w:spacing w:after="20"/>
+      </w:pPr>
+      <w:r>
+        <w:rPr>
+          <w:b/>
+          <w:bCs/>
+        </w:rPr>
+        <w:t xml:space="preserve">AI Evaluation: </w:t>
+      </w:r>
+      <w:r>
+        <w:t xml:space="preserve">Expert-level problem and benchmark design, prompt writing, failure-mode analysis of LLM reasoning, structured feedback, AI-assisted software development with test-based validation</w:t>
       </w:r>
     </w:p>
     <w:p>
@@ -216,6 +231,19 @@
     </w:p>
     <w:p>
       <w:pPr>
+        <w:pStyle w:val="ListParagraph"/>
+        <w:numPr>
+          <w:ilvl w:val="0"/>
+          <w:numId w:val="2"/>
+        </w:numPr>
+        <w:spacing w:after="10"/>
+      </w:pPr>
+      <w:r>
+        <w:t xml:space="preserve">Diagnosed failure modes in model reasoning and wrote structured feedback to improve scientific accuracy.</w:t>
+      </w:r>
+    </w:p>
+    <w:p>
+      <w:pPr>
         <w:pStyle w:val="EntryGap"/>
         <w:spacing w:after="0"/>
       </w:pPr>
@@ -357,7 +385,7 @@
         <w:spacing w:after="10"/>
       </w:pPr>
       <w:r>
-        <w:t xml:space="preserve">Developing WindsOfChange with the UW Forest Mycobiome Lab: a C++/R library for wind-driven spore dispersal over hilly forest terrain (RcppParallel, OpenMP).</w:t>
+        <w:t xml:space="preserve">Developing WindsOfChange with the UW Forest Mycobiome Lab: a C++/R library for wind-driven spore dispersal over hilly forest terrain (RcppParallel, OpenMP), using AI coding assistants validated by a unit-test suite.</w:t>
       </w:r>
     </w:p>
     <w:p>
@@ -787,7 +815,7 @@
       <w:r>
         <w:tab/>
       </w:r>
-      <w:hyperlink w:history="1" r:id="rIdfz8od5otsmw6cbuirh--b">
+      <w:hyperlink w:history="1" r:id="rIdhpirkwygbslu5y3r08esf">
         <w:r>
           <w:t xml:space="preserve">github.com/altjerue/ilwikak-ml</w:t>
         </w:r>
@@ -878,7 +906,7 @@
       <w:r>
         <w:t xml:space="preserve">, </w:t>
       </w:r>
-      <w:hyperlink w:history="1" r:id="rIdble__ussicphgqrweei2_">
+      <w:hyperlink w:history="1" r:id="rIdnx7-0_mi8vdcnu90ivdfw">
         <w:r>
           <w:t xml:space="preserve">ApJ 976, 182 (2024)</w:t>
         </w:r>
@@ -886,7 +914,7 @@
       <w:r>
         <w:t xml:space="preserve">, </w:t>
       </w:r>
-      <w:hyperlink w:history="1" r:id="rIdmqirahdkrqwu8lqdfgthi">
+      <w:hyperlink w:history="1" r:id="rId0-mg0o6v0rapn07p1ej8-">
         <w:r>
           <w:t xml:space="preserve">arXiv:2405.17581</w:t>
         </w:r>
@@ -924,7 +952,7 @@
       <w:r>
         <w:t xml:space="preserve">, </w:t>
       </w:r>
-      <w:hyperlink w:history="1" r:id="rIdqjknrsupp0w3s9etbcjup">
+      <w:hyperlink w:history="1" r:id="rId8o93qm6odpwgwij-fit39">
         <w:r>
           <w:t xml:space="preserve">MNRAS 501, 4092–4102 (2021)</w:t>
         </w:r>
@@ -932,7 +960,7 @@
       <w:r>
         <w:t xml:space="preserve">, </w:t>
       </w:r>
-      <w:hyperlink w:history="1" r:id="rIduu-nuilq-yjpzuheutb21">
+      <w:hyperlink w:history="1" r:id="rIdmscjxaxgewrqaoas1gbgk">
         <w:r>
           <w:t xml:space="preserve">arXiv:2009.02273</w:t>
         </w:r>
@@ -970,7 +998,7 @@
       <w:r>
         <w:t xml:space="preserve">, </w:t>
       </w:r>
-      <w:hyperlink w:history="1" r:id="rId6ggxu_zv1e_03sarc1j43">
+      <w:hyperlink w:history="1" r:id="rIdvs8qwp4dcpl5cd3glzdbl">
         <w:r>
           <w:t xml:space="preserve">MNRAS 468, 1169–1182 (2017)</w:t>
         </w:r>
@@ -978,7 +1006,7 @@
       <w:r>
         <w:t xml:space="preserve">, </w:t>
       </w:r>
-      <w:hyperlink w:history="1" r:id="rIdyebxvzmw7lc2-uqtzlagl">
+      <w:hyperlink w:history="1" r:id="rIdzqf7cfiydxhuahu4ei1pl">
         <w:r>
           <w:t xml:space="preserve">arXiv:1612.06383</w:t>
         </w:r>

</xml_diff>

<commit_message>
Name Claude as the AI coding assistant in the resume
Co-Authored-By: Claude Sonnet 5.5 <noreply@anthropic.com>
</commit_message>
<xml_diff>
--- a/RuedaBecerrilJM-resume-plain.docx
+++ b/RuedaBecerrilJM-resume-plain.docx
@@ -28,7 +28,7 @@
       <w:r>
         <w:t xml:space="preserve">  |  </w:t>
       </w:r>
-      <w:hyperlink w:history="1" r:id="rIdducyetrweo1i7fov8oyer">
+      <w:hyperlink w:history="1" r:id="rIdn76rurm_hd8xofhufyvxd">
         <w:r>
           <w:t xml:space="preserve">jm.ruebe@gmail.com</w:t>
         </w:r>
@@ -42,7 +42,7 @@
       <w:r>
         <w:t xml:space="preserve">  |  </w:t>
       </w:r>
-      <w:hyperlink w:history="1" r:id="rIdodsoy26leggcrbbtjommt">
+      <w:hyperlink w:history="1" r:id="rIddbzpgpq6rtsfocdzghvwb">
         <w:r>
           <w:t xml:space="preserve">linkedin.com/in/jeruebe</w:t>
         </w:r>
@@ -50,7 +50,7 @@
       <w:r>
         <w:t xml:space="preserve">  |  </w:t>
       </w:r>
-      <w:hyperlink w:history="1" r:id="rId9qahnu6gyfd6dqx18aspg">
+      <w:hyperlink w:history="1" r:id="rIdqjt3cl79xxde7vve8pl8s">
         <w:r>
           <w:t xml:space="preserve">altjerue.github.io</w:t>
         </w:r>
@@ -385,7 +385,7 @@
         <w:spacing w:after="10"/>
       </w:pPr>
       <w:r>
-        <w:t xml:space="preserve">Developing WindsOfChange with the UW Forest Mycobiome Lab: a C++/R library for wind-driven spore dispersal over hilly forest terrain (RcppParallel, OpenMP), using AI coding assistants validated by a unit-test suite.</w:t>
+        <w:t xml:space="preserve">Developing WindsOfChange with the UW Forest Mycobiome Lab: a C++/R library for wind-driven spore dispersal over hilly forest terrain (RcppParallel, OpenMP), using AI coding assistants (Claude), validated by a unit-test suite.</w:t>
       </w:r>
     </w:p>
     <w:p>
@@ -815,7 +815,7 @@
       <w:r>
         <w:tab/>
       </w:r>
-      <w:hyperlink w:history="1" r:id="rIdhpirkwygbslu5y3r08esf">
+      <w:hyperlink w:history="1" r:id="rIdb4yhtgvfml55bg9mirjfa">
         <w:r>
           <w:t xml:space="preserve">github.com/altjerue/ilwikak-ml</w:t>
         </w:r>
@@ -906,7 +906,7 @@
       <w:r>
         <w:t xml:space="preserve">, </w:t>
       </w:r>
-      <w:hyperlink w:history="1" r:id="rIdnx7-0_mi8vdcnu90ivdfw">
+      <w:hyperlink w:history="1" r:id="rIdzgltbcnkkgm_hucmkfnee">
         <w:r>
           <w:t xml:space="preserve">ApJ 976, 182 (2024)</w:t>
         </w:r>
@@ -914,7 +914,7 @@
       <w:r>
         <w:t xml:space="preserve">, </w:t>
       </w:r>
-      <w:hyperlink w:history="1" r:id="rId0-mg0o6v0rapn07p1ej8-">
+      <w:hyperlink w:history="1" r:id="rIdtfgydqb-upfyziqc-duct">
         <w:r>
           <w:t xml:space="preserve">arXiv:2405.17581</w:t>
         </w:r>
@@ -952,7 +952,7 @@
       <w:r>
         <w:t xml:space="preserve">, </w:t>
       </w:r>
-      <w:hyperlink w:history="1" r:id="rId8o93qm6odpwgwij-fit39">
+      <w:hyperlink w:history="1" r:id="rIdozhikpfia8ph6whzcvb1k">
         <w:r>
           <w:t xml:space="preserve">MNRAS 501, 4092–4102 (2021)</w:t>
         </w:r>
@@ -960,7 +960,7 @@
       <w:r>
         <w:t xml:space="preserve">, </w:t>
       </w:r>
-      <w:hyperlink w:history="1" r:id="rIdmscjxaxgewrqaoas1gbgk">
+      <w:hyperlink w:history="1" r:id="rIdnymrbdoxkgnjzx-i8-w5g">
         <w:r>
           <w:t xml:space="preserve">arXiv:2009.02273</w:t>
         </w:r>
@@ -998,7 +998,7 @@
       <w:r>
         <w:t xml:space="preserve">, </w:t>
       </w:r>
-      <w:hyperlink w:history="1" r:id="rIdvs8qwp4dcpl5cd3glzdbl">
+      <w:hyperlink w:history="1" r:id="rId1-uqi-fkuhicuihnyqfjw">
         <w:r>
           <w:t xml:space="preserve">MNRAS 468, 1169–1182 (2017)</w:t>
         </w:r>
@@ -1006,7 +1006,7 @@
       <w:r>
         <w:t xml:space="preserve">, </w:t>
       </w:r>
-      <w:hyperlink w:history="1" r:id="rIdzqf7cfiydxhuahu4ei1pl">
+      <w:hyperlink w:history="1" r:id="rIdqwonfvtaot2osuoqzkwup">
         <w:r>
           <w:t xml:space="preserve">arXiv:1612.06383</w:t>
         </w:r>

</xml_diff>

<commit_message>
Reducing resume size. Mreging experience list items.
</commit_message>
<xml_diff>
--- a/RuedaBecerrilJM-resume-plain.docx
+++ b/RuedaBecerrilJM-resume-plain.docx
@@ -28,7 +28,7 @@
       <w:r>
         <w:t xml:space="preserve">  |  </w:t>
       </w:r>
-      <w:hyperlink w:history="1" r:id="rIdhirdfgiu3myuul0julwug">
+      <w:hyperlink w:history="1" r:id="rIdapfvqyxwvcbmaabhrgohj">
         <w:r>
           <w:t xml:space="preserve">jm.ruebe@gmail.com</w:t>
         </w:r>
@@ -42,7 +42,7 @@
       <w:r>
         <w:t xml:space="preserve">  |  </w:t>
       </w:r>
-      <w:hyperlink w:history="1" r:id="rId7mbqwcfw8t7pb493rqv-9">
+      <w:hyperlink w:history="1" r:id="rIdhiqibdjxrwbtnkzed03fj">
         <w:r>
           <w:t xml:space="preserve">linkedin.com/in/jeruebe</w:t>
         </w:r>
@@ -50,7 +50,7 @@
       <w:r>
         <w:t xml:space="preserve">  |  </w:t>
       </w:r>
-      <w:hyperlink w:history="1" r:id="rIdgpqaogmgglfunxbkv0_lj">
+      <w:hyperlink w:history="1" r:id="rIdecw_uaj9aoe6052-qg6pv">
         <w:r>
           <w:t xml:space="preserve">altjerue.github.io</w:t>
         </w:r>
@@ -140,113 +140,13 @@
           <w:b/>
           <w:bCs/>
         </w:rPr>
-        <w:t xml:space="preserve">Zachary Davis, graduate student</w:t>
+        <w:t xml:space="preserve">Zachary Davis, Amanda O. Harrison, and Hao Zhang, graduate students</w:t>
       </w:r>
       <w:r>
         <w:tab/>
       </w:r>
       <w:r>
         <w:t xml:space="preserve">2018 – 2022</w:t>
-      </w:r>
-    </w:p>
-    <w:p>
-      <w:pPr>
-        <w:keepNext/>
-        <w:tabs>
-          <w:tab w:val="right" w:pos="10512"/>
-        </w:tabs>
-        <w:spacing w:after="0"/>
-      </w:pPr>
-      <w:r>
-        <w:rPr>
-          <w:i/>
-          <w:iCs/>
-        </w:rPr>
-        <w:t xml:space="preserve">Department of Physics and Astronomy, Purdue University</w:t>
-      </w:r>
-      <w:r>
-        <w:tab/>
-      </w:r>
-      <w:r>
-        <w:t xml:space="preserve">Mentoring</w:t>
-      </w:r>
-    </w:p>
-    <w:p>
-      <w:pPr>
-        <w:pStyle w:val="EntryGap"/>
-        <w:spacing w:after="0"/>
-      </w:pPr>
-    </w:p>
-    <w:p>
-      <w:pPr>
-        <w:keepNext/>
-        <w:tabs>
-          <w:tab w:val="right" w:pos="10512"/>
-        </w:tabs>
-        <w:spacing w:after="0"/>
-      </w:pPr>
-      <w:r>
-        <w:rPr>
-          <w:b/>
-          <w:bCs/>
-        </w:rPr>
-        <w:t xml:space="preserve">Amanda O. Harrison, graduate student</w:t>
-      </w:r>
-      <w:r>
-        <w:tab/>
-      </w:r>
-      <w:r>
-        <w:t xml:space="preserve">2018 – 2020</w:t>
-      </w:r>
-    </w:p>
-    <w:p>
-      <w:pPr>
-        <w:keepNext/>
-        <w:tabs>
-          <w:tab w:val="right" w:pos="10512"/>
-        </w:tabs>
-        <w:spacing w:after="0"/>
-      </w:pPr>
-      <w:r>
-        <w:rPr>
-          <w:i/>
-          <w:iCs/>
-        </w:rPr>
-        <w:t xml:space="preserve">Department of Physics and Astronomy, Purdue University</w:t>
-      </w:r>
-      <w:r>
-        <w:tab/>
-      </w:r>
-      <w:r>
-        <w:t xml:space="preserve">Mentoring</w:t>
-      </w:r>
-    </w:p>
-    <w:p>
-      <w:pPr>
-        <w:pStyle w:val="EntryGap"/>
-        <w:spacing w:after="0"/>
-      </w:pPr>
-    </w:p>
-    <w:p>
-      <w:pPr>
-        <w:keepNext/>
-        <w:tabs>
-          <w:tab w:val="right" w:pos="10512"/>
-        </w:tabs>
-        <w:spacing w:after="0"/>
-      </w:pPr>
-      <w:r>
-        <w:rPr>
-          <w:b/>
-          <w:bCs/>
-        </w:rPr>
-        <w:t xml:space="preserve">Hao Zhang, graduate student</w:t>
-      </w:r>
-      <w:r>
-        <w:tab/>
-      </w:r>
-      <w:r>
-        <w:t xml:space="preserve">2018 – 2019</w:t>
       </w:r>
     </w:p>
     <w:p>
@@ -449,7 +349,7 @@
         <w:spacing w:after="10"/>
       </w:pPr>
       <w:r>
-        <w:t xml:space="preserve">Evaluate physics reasoning in AI model outputs for technical accuracy, identifying failure modes and providing structured feedback.</w:t>
+        <w:t xml:space="preserve">Evaluate physics reasoning in AI model outputs, identifying failure modes and providing structured feedback.</w:t>
       </w:r>
     </w:p>
     <w:p>
@@ -471,7 +371,7 @@
           <w:b/>
           <w:bCs/>
         </w:rPr>
-        <w:t xml:space="preserve">Postdoctoral Research Fellow</w:t>
+        <w:t xml:space="preserve">Spatial Data Scientist</w:t>
       </w:r>
       <w:r>
         <w:t xml:space="preserve">, </w:t>
@@ -481,13 +381,13 @@
           <w:i/>
           <w:iCs/>
         </w:rPr>
-        <w:t xml:space="preserve">Purdue University</w:t>
-      </w:r>
-      <w:r>
-        <w:tab/>
-      </w:r>
-      <w:r>
-        <w:t xml:space="preserve">Oct 2018 – Nov 2020</w:t>
+        <w:t xml:space="preserve">TealWaters</w:t>
+      </w:r>
+      <w:r>
+        <w:tab/>
+      </w:r>
+      <w:r>
+        <w:t xml:space="preserve">May 2025 – Jan 2026</w:t>
       </w:r>
     </w:p>
     <w:p>
@@ -500,7 +400,45 @@
         <w:spacing w:after="10"/>
       </w:pPr>
       <w:r>
-        <w:t xml:space="preserve">Obtained and led a NASA-funded grant studying radiation from active galaxies.</w:t>
+        <w:t xml:space="preserve">Mapped wetland probability with a random-forest model (&gt;75% accuracy) and optimized terrain-analysis code.</w:t>
+      </w:r>
+    </w:p>
+    <w:p>
+      <w:pPr>
+        <w:pStyle w:val="EntryGap"/>
+        <w:spacing w:after="0"/>
+      </w:pPr>
+    </w:p>
+    <w:p>
+      <w:pPr>
+        <w:keepNext/>
+        <w:tabs>
+          <w:tab w:val="right" w:pos="10512"/>
+        </w:tabs>
+        <w:spacing w:after="0"/>
+      </w:pPr>
+      <w:r>
+        <w:rPr>
+          <w:b/>
+          <w:bCs/>
+        </w:rPr>
+        <w:t xml:space="preserve">Independent Researcher &amp; Open-Source Developer</w:t>
+      </w:r>
+      <w:r>
+        <w:t xml:space="preserve">, </w:t>
+      </w:r>
+      <w:r>
+        <w:rPr>
+          <w:i/>
+          <w:iCs/>
+        </w:rPr>
+        <w:t xml:space="preserve">Self-directed</w:t>
+      </w:r>
+      <w:r>
+        <w:tab/>
+      </w:r>
+      <w:r>
+        <w:t xml:space="preserve">Jan 2024 – May 2025</w:t>
       </w:r>
     </w:p>
     <w:p>
@@ -513,7 +451,45 @@
         <w:spacing w:after="10"/>
       </w:pPr>
       <w:r>
-        <w:t xml:space="preserve">Mentored three graduate researchers; two are now postdoctoral researchers.</w:t>
+        <w:t xml:space="preserve">Co-developed Tleco, a Rust/Python toolkit for radiation from relativistic outflows, published in ApJ (2024).</w:t>
+      </w:r>
+    </w:p>
+    <w:p>
+      <w:pPr>
+        <w:pStyle w:val="EntryGap"/>
+        <w:spacing w:after="0"/>
+      </w:pPr>
+    </w:p>
+    <w:p>
+      <w:pPr>
+        <w:keepNext/>
+        <w:tabs>
+          <w:tab w:val="right" w:pos="10512"/>
+        </w:tabs>
+        <w:spacing w:after="0"/>
+      </w:pPr>
+      <w:r>
+        <w:rPr>
+          <w:b/>
+          <w:bCs/>
+        </w:rPr>
+        <w:t xml:space="preserve">Software Engineer</w:t>
+      </w:r>
+      <w:r>
+        <w:t xml:space="preserve">, </w:t>
+      </w:r>
+      <w:r>
+        <w:rPr>
+          <w:i/>
+          <w:iCs/>
+        </w:rPr>
+        <w:t xml:space="preserve">Paychex</w:t>
+      </w:r>
+      <w:r>
+        <w:tab/>
+      </w:r>
+      <w:r>
+        <w:t xml:space="preserve">Apr 2022 – Jan 2024</w:t>
       </w:r>
     </w:p>
     <w:p>
@@ -526,7 +502,7 @@
         <w:spacing w:after="10"/>
       </w:pPr>
       <w:r>
-        <w:t xml:space="preserve">Published 3 peer-reviewed papers.</w:t>
+        <w:t xml:space="preserve">Developed and tested production data-pipeline software (Java, Python, SQL).</w:t>
       </w:r>
     </w:p>
     <w:p>
@@ -577,7 +553,45 @@
         <w:spacing w:after="10"/>
       </w:pPr>
       <w:r>
-        <w:t xml:space="preserve">Led an NSF-sponsored project upgrading a high-performance simulation code for modeling black hole binaries.</w:t>
+        <w:t xml:space="preserve">Led an NSF-sponsored upgrade of a simulation code for black hole binaries; collaborated on a multi-institutional study of binary neutron star mergers (2 publications).</w:t>
+      </w:r>
+    </w:p>
+    <w:p>
+      <w:pPr>
+        <w:pStyle w:val="EntryGap"/>
+        <w:spacing w:after="0"/>
+      </w:pPr>
+    </w:p>
+    <w:p>
+      <w:pPr>
+        <w:keepNext/>
+        <w:tabs>
+          <w:tab w:val="right" w:pos="10512"/>
+        </w:tabs>
+        <w:spacing w:after="0"/>
+      </w:pPr>
+      <w:r>
+        <w:rPr>
+          <w:b/>
+          <w:bCs/>
+        </w:rPr>
+        <w:t xml:space="preserve">Postdoctoral Research Fellow</w:t>
+      </w:r>
+      <w:r>
+        <w:t xml:space="preserve">, </w:t>
+      </w:r>
+      <w:r>
+        <w:rPr>
+          <w:i/>
+          <w:iCs/>
+        </w:rPr>
+        <w:t xml:space="preserve">Purdue University</w:t>
+      </w:r>
+      <w:r>
+        <w:tab/>
+      </w:r>
+      <w:r>
+        <w:t xml:space="preserve">Oct 2018 – Nov 2020</w:t>
       </w:r>
     </w:p>
     <w:p>
@@ -590,7 +604,7 @@
         <w:spacing w:after="10"/>
       </w:pPr>
       <w:r>
-        <w:t xml:space="preserve">Collaborated on a multi-institutional study of binary neutron star mergers, resulting in 2 publications.</w:t>
+        <w:t xml:space="preserve">Co-I in a NASA-funded grant studying radiation from active galaxies; mentored three graduate researchers; published 3 peer-reviewed papers.</w:t>
       </w:r>
     </w:p>
     <w:p>
@@ -629,19 +643,6 @@
       </w:r>
       <w:r>
         <w:t xml:space="preserve">Jan – Sep 2018</w:t>
-      </w:r>
-    </w:p>
-    <w:p>
-      <w:pPr>
-        <w:pStyle w:val="ListParagraph"/>
-        <w:numPr>
-          <w:ilvl w:val="0"/>
-          <w:numId w:val="2"/>
-        </w:numPr>
-        <w:spacing w:after="10"/>
-      </w:pPr>
-      <w:r>
-        <w:t xml:space="preserve">Developed a Python pipeline to process black hole simulation outputs from the GRTrans numerical code, generating SVM training data for radio image prediction.</w:t>
       </w:r>
     </w:p>
     <w:p>

</xml_diff>

<commit_message>
Acheived one page resume
</commit_message>
<xml_diff>
--- a/RuedaBecerrilJM-resume-plain.docx
+++ b/RuedaBecerrilJM-resume-plain.docx
@@ -28,7 +28,7 @@
       <w:r>
         <w:t xml:space="preserve">  |  </w:t>
       </w:r>
-      <w:hyperlink w:history="1" r:id="rIdapfvqyxwvcbmaabhrgohj">
+      <w:hyperlink w:history="1" r:id="rIdt458ls1w13cvpwdwboy1-">
         <w:r>
           <w:t xml:space="preserve">jm.ruebe@gmail.com</w:t>
         </w:r>
@@ -42,7 +42,7 @@
       <w:r>
         <w:t xml:space="preserve">  |  </w:t>
       </w:r>
-      <w:hyperlink w:history="1" r:id="rIdhiqibdjxrwbtnkzed03fj">
+      <w:hyperlink w:history="1" r:id="rIdjqsticuaphe7ehgrgvuht">
         <w:r>
           <w:t xml:space="preserve">linkedin.com/in/jeruebe</w:t>
         </w:r>
@@ -50,7 +50,7 @@
       <w:r>
         <w:t xml:space="preserve">  |  </w:t>
       </w:r>
-      <w:hyperlink w:history="1" r:id="rIdecw_uaj9aoe6052-qg6pv">
+      <w:hyperlink w:history="1" r:id="rIdpnfoghb5sd_wx2rvyskfw">
         <w:r>
           <w:t xml:space="preserve">altjerue.github.io</w:t>
         </w:r>
@@ -66,7 +66,7 @@
     </w:p>
     <w:p>
       <w:r>
-        <w:t xml:space="preserve">Physicist (Ph.D. and M.Sc. in Physics) with ten years of research in computational astrophysics. Taught a graduate thermodynamics course and mentored three graduate researchers who co-authored papers with me. Teaching approach built on intuition, critical thinking, and collaborative problem-solving.</w:t>
+        <w:t xml:space="preserve">Physicist (Ph.D. and M.Sc. in Physics) with ten years of research in computational astrophysics. Substituted for a graduate thermodynamics course and mentored three graduate researchers who co-authored papers with me. Teaching approach built on intuition, critical thinking, and collaborative problem-solving.</w:t>
       </w:r>
     </w:p>
     <w:p>

</xml_diff>